<commit_message>
docs(affiliation): rectify author affiliation to Independent Researcher and Civil / Site Engineer across manuscript and repository
- Methodological Rationale: Replace obsolete institutional placeholder with author's verified professional status as an Independent Researcher and practicing Civil / Site Engineer.
- Pipeline Impact: Aligns all author metadata across APA 7th Edition manuscript (DOCX and Markdown), PRISMA 2020 checklist, OSF changelog, and README documentation ahead of peer-review submission and Zenodo archival.
</commit_message>
<xml_diff>
--- a/08_Supplements/PRISMA_2020_Checklist.docx
+++ b/08_Supplements/PRISMA_2020_Checklist.docx
@@ -14,12 +14,11 @@
     </w:p>
     <w:p>
       <w:r>
-        <w:rPr>
-          <w:i/>
-        </w:rPr>
         <w:t>Project: Sustainable Building Materials in Africa (2015–2025): A Systematic Review</w:t>
         <w:br/>
         <w:t>Lead Author: Agbeniga Agboola (ORCID: 0009-0005-6878-1661)</w:t>
+        <w:br/>
+        <w:t>Affiliation: Independent Researcher and Civil / Site Engineer</w:t>
         <w:br/>
         <w:t>Registered OSF Project: https://osf.io/dvukp/ | Permanent Zenodo DOI: 10.5281/zenodo.22771539 | Date: 2026-09-15</w:t>
       </w:r>

</xml_diff>